<commit_message>
Caption formatting, instance sizing, and keeping broken lines together
Native image captions print at 9pt italic, with the Cs twins so the size and
slant reach complex scripts too. Run properties are inserted in schema order.

The instance title field had inherited the base textarea min-height of 112px
when it became a textarea; it now matches the note fragment at 34px.

A paragraph holding a manual line break gets keepLines, so Word stops splitting
a lead-in from the URL beneath it. keepNext cannot help there: both lines live
in one paragraph, and keepNext only binds a paragraph to the next one.

Also carries the concurrent thick-client, limitations-offer and non-production
label work, and the MAIN_TEST to MAIN template rename.
</commit_message>
<xml_diff>
--- a/resources/MAIN_ASIA.docx
+++ b/resources/MAIN_ASIA.docx
@@ -3241,7 +3241,13 @@
         <w:jc w:val="both"/>
       </w:pPr>
       <w:r>
-        <w:t>Information about the penetration testing policies can be found in Table 2 below.</w:t>
+        <w:t xml:space="preserve">Information about the penetration testing policies can be found in Table </w:t>
+      </w:r>
+      <w:r>
+        <w:t>3</w:t>
+      </w:r>
+      <w:r>
+        <w:t xml:space="preserve"> below.</w:t>
       </w:r>
     </w:p>
     <w:p/>
@@ -6448,24 +6454,14 @@
         <w:lastRenderedPageBreak/>
         <w:t xml:space="preserve">Table </w:t>
       </w:r>
-      <w:r>
-        <w:fldChar w:fldCharType="begin"/>
-      </w:r>
-      <w:r>
-        <w:instrText xml:space="preserve"> SEQ Table \* ARABIC </w:instrText>
-      </w:r>
-      <w:r>
-        <w:fldChar w:fldCharType="separate"/>
-      </w:r>
-      <w:r>
-        <w:rPr>
-          <w:noProof/>
-        </w:rPr>
-        <w:t>13</w:t>
-      </w:r>
-      <w:r>
-        <w:fldChar w:fldCharType="end"/>
-      </w:r>
+      <w:fldSimple w:instr=" SEQ Table \* ARABIC ">
+        <w:r>
+          <w:rPr>
+            <w:noProof/>
+          </w:rPr>
+          <w:t>13</w:t>
+        </w:r>
+      </w:fldSimple>
       <w:r>
         <w:t xml:space="preserve"> </w:t>
       </w:r>
@@ -7687,7 +7683,6 @@
             </w:rPr>
             <w:fldChar w:fldCharType="separate"/>
           </w:r>
-          <w:proofErr w:type="spellStart"/>
           <w:r>
             <w:rPr>
               <w:sz w:val="20"/>
@@ -7695,7 +7690,6 @@
             </w:rPr>
             <w:t>i</w:t>
           </w:r>
-          <w:proofErr w:type="spellEnd"/>
           <w:r>
             <w:rPr>
               <w:noProof/>
@@ -12548,6 +12542,7 @@
     <w:rsid w:val="00292BBD"/>
     <w:rsid w:val="002A5F7C"/>
     <w:rsid w:val="002D649E"/>
+    <w:rsid w:val="00350CBF"/>
     <w:rsid w:val="003D402F"/>
     <w:rsid w:val="00433CE5"/>
     <w:rsid w:val="004513B0"/>
@@ -12577,6 +12572,7 @@
     <w:rsid w:val="00BF56C4"/>
     <w:rsid w:val="00C14033"/>
     <w:rsid w:val="00C23958"/>
+    <w:rsid w:val="00C37392"/>
     <w:rsid w:val="00C609B8"/>
     <w:rsid w:val="00C7709A"/>
     <w:rsid w:val="00C87CC1"/>

</xml_diff>